<commit_message>
feat: indices unicos parciales y de apoyo en postgresql
</commit_message>
<xml_diff>
--- a/docs/diseno/validaciones-bd-bajas-y-modificaciones.docx
+++ b/docs/diseno/validaciones-bd-bajas-y-modificaciones.docx
@@ -809,7 +809,7 @@
                 <w:sz w:val="19"/>
                 <w:szCs w:val="19"/>
               </w:rPr>
-              <w:t xml:space="preserve">UNIQUE para los nombres; índice único parcial para el resto</w:t>
+              <w:t xml:space="preserve">UNIQUE para los nombres y el término de glosario; índice único parcial para inscripción y docente</w:t>
             </w:r>
           </w:p>
         </w:tc>
@@ -1934,7 +1934,7 @@
           <w:sz w:val="22"/>
           <w:szCs w:val="22"/>
         </w:rPr>
-        <w:t xml:space="preserve">Un índice permite encontrar filas sin recorrer toda la tabla. Se usan de dos tipos. Los índices únicos parciales hacen cumplir las unicidades de 3.4.1 que se limitan a registros activos: TerminoGlosario(unidad, término), Inscripción(alumno, cohorte) y DocenteCurso(curso, docente). Los índices de apoyo se crean sobre la clave foránea de las tablas hijas, porque PostgreSQL no los crea solo y los disparadores de baja y de datos congelados consultan justamente esos registros: Curso(categoría), Programa(curso), Unidad(curso), Cohorte(programa), Inscripción(cohorte), ClaseEnVivo(cohorte), Material(unidad), Pool(unidad), Autoevaluación(unidad), IntentoAutoevaluación(autoevaluación), ConsultaForo(unidad), RespuestaForo(consulta) y UnidadCronograma(unidad). Todos son parciales (baja = falso), ya que solo se consultan registros activos.</w:t>
+        <w:t xml:space="preserve">Un índice permite encontrar filas sin recorrer toda la tabla. Se usan de dos tipos. Los índices únicos parciales hacen cumplir las unicidades de 3.4.1 que se limitan a registros activos: Inscripción(alumno, cohorte) y DocenteCurso(curso, docente). Los índices de apoyo se crean sobre la clave foránea de las tablas hijas, porque PostgreSQL no los crea solo y los disparadores de baja y de datos congelados consultan justamente esos registros: Curso(categoría), Programa(curso), Cohorte(programa), Inscripción(cohorte), ClaseEnVivo(cohorte), Material(unidad), Autoevaluación(unidad), IntentoAutoevaluación(autoevaluación), ConsultaForo(unidad), RespuestaForo(consulta) y UnidadCronograma(unidad), más AutoevaluacionPool(pool), que no tiene baja. Todos son parciales (baja = falso), salvo este último, ya que solo se consultan registros activos. No hace falta repetir los casos que ya cubre un UNIQUE existente: Unidad por curso, Pool por unidad y término de glosario por unidad.</w:t>
       </w:r>
     </w:p>
     <w:p>

</xml_diff>

<commit_message>
feat: triggers de negocio: cupo, preguntas, pago, etc.
</commit_message>
<xml_diff>
--- a/docs/diseno/validaciones-bd-bajas-y-modificaciones.docx
+++ b/docs/diseno/validaciones-bd-bajas-y-modificaciones.docx
@@ -1738,7 +1738,7 @@
                 <w:sz w:val="19"/>
                 <w:szCs w:val="19"/>
               </w:rPr>
-              <w:t xml:space="preserve">No se supera el cupo de una cohorte aunque dos alumnos se inscriban al mismo tiempo (CU-45, 46).</w:t>
+              <w:t xml:space="preserve">No se supera el cupo de una cohorte, que ocupan las inscripciones habilitadas, aunque dos alumnos se habiliten al mismo tiempo (CU-45, 46).</w:t>
             </w:r>
           </w:p>
         </w:tc>
@@ -1770,7 +1770,7 @@
                 <w:sz w:val="19"/>
                 <w:szCs w:val="19"/>
               </w:rPr>
-              <w:t xml:space="preserve">Disparador que bloquea la cohorte mientras cuenta las inscripciones activas</w:t>
+              <w:t xml:space="preserve">Disparador que bloquea la cohorte mientras cuenta las inscripciones habilitadas</w:t>
             </w:r>
           </w:p>
         </w:tc>
@@ -1839,7 +1839,7 @@
                 <w:sz w:val="19"/>
                 <w:szCs w:val="19"/>
               </w:rPr>
-              <w:t xml:space="preserve">Cada pregunta tiene al menos dos opciones y una sola correcta, y el pool al menos una pregunta (CU-61, 62).</w:t>
+              <w:t xml:space="preserve">Cada pregunta tiene al menos dos opciones y una sola correcta (al menos una, si es de opción múltiple), y el pool al menos una pregunta (CU-61, 62).</w:t>
             </w:r>
           </w:p>
         </w:tc>

</xml_diff>